<commit_message>
the file data is changed
</commit_message>
<xml_diff>
--- a/A+ - Understanding and maintenance of Networks/DAY-03 Understanding and maintenance of Networks.docx
+++ b/A+ - Understanding and maintenance of Networks/DAY-03 Understanding and maintenance of Networks.docx
@@ -15,7 +15,6 @@
           <w:lang w:val="en-US"/>
         </w:rPr>
       </w:pPr>
-      <w:proofErr w:type="spellStart"/>
       <w:r>
         <w:rPr>
           <w:rFonts w:ascii="Times New Roman" w:hAnsi="Times New Roman" w:cs="Times New Roman"/>
@@ -25,19 +24,7 @@
           <w:szCs w:val="44"/>
           <w:lang w:val="en-US"/>
         </w:rPr>
-        <w:t>CompTia</w:t>
-      </w:r>
-      <w:proofErr w:type="spellEnd"/>
-      <w:r>
-        <w:rPr>
-          <w:rFonts w:ascii="Times New Roman" w:hAnsi="Times New Roman" w:cs="Times New Roman"/>
-          <w:b/>
-          <w:bCs/>
-          <w:sz w:val="44"/>
-          <w:szCs w:val="44"/>
-          <w:lang w:val="en-US"/>
-        </w:rPr>
-        <w:t xml:space="preserve"> A+</w:t>
+        <w:t>CompTia A+</w:t>
       </w:r>
     </w:p>
     <w:p>
@@ -89,118 +76,45 @@
           <w:szCs w:val="36"/>
           <w:lang w:val="en-US"/>
         </w:rPr>
-        <w:t>Assignment-1</w:t>
-      </w:r>
-    </w:p>
-    <w:p>
-      <w:pPr>
-        <w:rPr>
-          <w:rFonts w:ascii="Times New Roman" w:hAnsi="Times New Roman" w:cs="Times New Roman"/>
-          <w:sz w:val="28"/>
-          <w:szCs w:val="28"/>
-        </w:rPr>
-      </w:pPr>
-      <w:r>
-        <w:rPr>
-          <w:rFonts w:ascii="Times New Roman" w:hAnsi="Times New Roman" w:cs="Times New Roman"/>
-          <w:sz w:val="28"/>
-          <w:szCs w:val="28"/>
-        </w:rPr>
-        <w:t xml:space="preserve">Day 2: Routers and </w:t>
-      </w:r>
-      <w:proofErr w:type="spellStart"/>
-      <w:r>
-        <w:rPr>
-          <w:rFonts w:ascii="Times New Roman" w:hAnsi="Times New Roman" w:cs="Times New Roman"/>
-          <w:sz w:val="28"/>
-          <w:szCs w:val="28"/>
-        </w:rPr>
-        <w:t>SwitchesTheory</w:t>
-      </w:r>
-      <w:proofErr w:type="spellEnd"/>
-      <w:r>
-        <w:rPr>
-          <w:rFonts w:ascii="Times New Roman" w:hAnsi="Times New Roman" w:cs="Times New Roman"/>
-          <w:sz w:val="28"/>
-          <w:szCs w:val="28"/>
-        </w:rPr>
-        <w:t xml:space="preserve"> (30 min</w:t>
-      </w:r>
-      <w:proofErr w:type="gramStart"/>
-      <w:r>
-        <w:rPr>
-          <w:rFonts w:ascii="Times New Roman" w:hAnsi="Times New Roman" w:cs="Times New Roman"/>
-          <w:sz w:val="28"/>
-          <w:szCs w:val="28"/>
-        </w:rPr>
-        <w:t>):Basic</w:t>
-      </w:r>
-      <w:proofErr w:type="gramEnd"/>
-      <w:r>
-        <w:rPr>
-          <w:rFonts w:ascii="Times New Roman" w:hAnsi="Times New Roman" w:cs="Times New Roman"/>
-          <w:sz w:val="28"/>
-          <w:szCs w:val="28"/>
-        </w:rPr>
-        <w:t xml:space="preserve"> functions and differences between routers and </w:t>
-      </w:r>
-      <w:proofErr w:type="spellStart"/>
-      <w:proofErr w:type="gramStart"/>
-      <w:r>
-        <w:rPr>
-          <w:rFonts w:ascii="Times New Roman" w:hAnsi="Times New Roman" w:cs="Times New Roman"/>
-          <w:sz w:val="28"/>
-          <w:szCs w:val="28"/>
-        </w:rPr>
-        <w:t>switches.Practical</w:t>
-      </w:r>
-      <w:proofErr w:type="spellEnd"/>
-      <w:proofErr w:type="gramEnd"/>
-      <w:r>
-        <w:rPr>
-          <w:rFonts w:ascii="Times New Roman" w:hAnsi="Times New Roman" w:cs="Times New Roman"/>
-          <w:sz w:val="28"/>
-          <w:szCs w:val="28"/>
-        </w:rPr>
-        <w:t xml:space="preserve"> (30 min</w:t>
-      </w:r>
-      <w:proofErr w:type="gramStart"/>
-      <w:r>
-        <w:rPr>
-          <w:rFonts w:ascii="Times New Roman" w:hAnsi="Times New Roman" w:cs="Times New Roman"/>
-          <w:sz w:val="28"/>
-          <w:szCs w:val="28"/>
-        </w:rPr>
-        <w:t>):Identify</w:t>
-      </w:r>
-      <w:proofErr w:type="gramEnd"/>
-      <w:r>
-        <w:rPr>
-          <w:rFonts w:ascii="Times New Roman" w:hAnsi="Times New Roman" w:cs="Times New Roman"/>
-          <w:sz w:val="28"/>
-          <w:szCs w:val="28"/>
-        </w:rPr>
-        <w:t xml:space="preserve"> ports and LEDs on a router and switch.</w:t>
-      </w:r>
-    </w:p>
-    <w:p>
-      <w:pPr>
-        <w:rPr>
-          <w:rFonts w:ascii="Times New Roman" w:hAnsi="Times New Roman" w:cs="Times New Roman"/>
-          <w:sz w:val="28"/>
-          <w:szCs w:val="28"/>
-        </w:rPr>
-      </w:pPr>
+        <w:t>Assignment-</w:t>
+      </w:r>
       <w:r>
         <w:rPr>
           <w:rFonts w:ascii="Times New Roman" w:hAnsi="Times New Roman" w:cs="Times New Roman"/>
           <w:b/>
           <w:bCs/>
-          <w:sz w:val="28"/>
-          <w:szCs w:val="28"/>
-        </w:rPr>
-        <w:t>QUE-0</w:t>
-      </w:r>
+          <w:sz w:val="36"/>
+          <w:szCs w:val="36"/>
+          <w:lang w:val="en-US"/>
+        </w:rPr>
+        <w:t>3</w:t>
+      </w:r>
+    </w:p>
+    <w:p>
+      <w:pPr>
+        <w:rPr>
+          <w:rFonts w:ascii="Times New Roman" w:hAnsi="Times New Roman" w:cs="Times New Roman"/>
+          <w:sz w:val="28"/>
+          <w:szCs w:val="28"/>
+        </w:rPr>
+      </w:pPr>
+      <w:r>
+        <w:rPr>
+          <w:rFonts w:ascii="Times New Roman" w:hAnsi="Times New Roman" w:cs="Times New Roman"/>
+          <w:sz w:val="28"/>
+          <w:szCs w:val="28"/>
+        </w:rPr>
+        <w:t>Day 2: Routers and SwitchesTheory (30 min):Basic functions and differences between routers and switches.Practical (30 min):Identify ports and LEDs on a router and switch.</w:t>
+      </w:r>
+    </w:p>
+    <w:p>
+      <w:pPr>
+        <w:rPr>
+          <w:rFonts w:ascii="Times New Roman" w:hAnsi="Times New Roman" w:cs="Times New Roman"/>
+          <w:sz w:val="28"/>
+          <w:szCs w:val="28"/>
+        </w:rPr>
+      </w:pPr>
       <w:r>
         <w:rPr>
           <w:rFonts w:ascii="Times New Roman" w:hAnsi="Times New Roman" w:cs="Times New Roman"/>
@@ -209,7 +123,7 @@
           <w:sz w:val="28"/>
           <w:szCs w:val="28"/>
         </w:rPr>
-        <w:t>1</w:t>
+        <w:t>QUE-0</w:t>
       </w:r>
       <w:r>
         <w:rPr>
@@ -219,6 +133,16 @@
           <w:sz w:val="28"/>
           <w:szCs w:val="28"/>
         </w:rPr>
+        <w:t>1</w:t>
+      </w:r>
+      <w:r>
+        <w:rPr>
+          <w:rFonts w:ascii="Times New Roman" w:hAnsi="Times New Roman" w:cs="Times New Roman"/>
+          <w:b/>
+          <w:bCs/>
+          <w:sz w:val="28"/>
+          <w:szCs w:val="28"/>
+        </w:rPr>
         <w:t xml:space="preserve"> </w:t>
       </w:r>
       <w:r>
@@ -227,25 +151,7 @@
           <w:sz w:val="28"/>
           <w:szCs w:val="28"/>
         </w:rPr>
-        <w:t xml:space="preserve">Draw a labelled diagram of a typical home </w:t>
-      </w:r>
-      <w:proofErr w:type="spellStart"/>
-      <w:r>
-        <w:rPr>
-          <w:rFonts w:ascii="Times New Roman" w:hAnsi="Times New Roman" w:cs="Times New Roman"/>
-          <w:sz w:val="28"/>
-          <w:szCs w:val="28"/>
-        </w:rPr>
-        <w:t>WiFi</w:t>
-      </w:r>
-      <w:proofErr w:type="spellEnd"/>
-      <w:r>
-        <w:rPr>
-          <w:rFonts w:ascii="Times New Roman" w:hAnsi="Times New Roman" w:cs="Times New Roman"/>
-          <w:sz w:val="28"/>
-          <w:szCs w:val="28"/>
-        </w:rPr>
-        <w:t xml:space="preserve"> router and a network switch, clearly marking at least 3 different ports (such as WAN, LAN, Console) and the location of status LEDs.</w:t>
+        <w:t>Draw a labelled diagram of a typical home WiFi router and a network switch, clearly marking at least 3 different ports (such as WAN, LAN, Console) and the location of status LEDs.</w:t>
       </w:r>
     </w:p>
     <w:p>
@@ -422,97 +328,7 @@
           <w:sz w:val="28"/>
           <w:szCs w:val="28"/>
         </w:rPr>
-        <w:t>List 3 key differences between routers and switches in terms of their main functions and how they handle network traffic.&lt;</w:t>
-      </w:r>
-      <w:proofErr w:type="spellStart"/>
-      <w:r>
-        <w:rPr>
-          <w:rFonts w:ascii="Times New Roman" w:hAnsi="Times New Roman" w:cs="Times New Roman"/>
-          <w:sz w:val="28"/>
-          <w:szCs w:val="28"/>
-        </w:rPr>
-        <w:t>br</w:t>
-      </w:r>
-      <w:proofErr w:type="spellEnd"/>
-      <w:r>
-        <w:rPr>
-          <w:rFonts w:ascii="Times New Roman" w:hAnsi="Times New Roman" w:cs="Times New Roman"/>
-          <w:sz w:val="28"/>
-          <w:szCs w:val="28"/>
-        </w:rPr>
-        <w:t>&gt;&lt;</w:t>
-      </w:r>
-      <w:proofErr w:type="spellStart"/>
-      <w:r>
-        <w:rPr>
-          <w:rFonts w:ascii="Times New Roman" w:hAnsi="Times New Roman" w:cs="Times New Roman"/>
-          <w:sz w:val="28"/>
-          <w:szCs w:val="28"/>
-        </w:rPr>
-        <w:t>br</w:t>
-      </w:r>
-      <w:proofErr w:type="spellEnd"/>
-      <w:r>
-        <w:rPr>
-          <w:rFonts w:ascii="Times New Roman" w:hAnsi="Times New Roman" w:cs="Times New Roman"/>
-          <w:sz w:val="28"/>
-          <w:szCs w:val="28"/>
-        </w:rPr>
-        <w:t>&gt;&lt;</w:t>
-      </w:r>
-      <w:proofErr w:type="spellStart"/>
-      <w:r>
-        <w:rPr>
-          <w:rFonts w:ascii="Times New Roman" w:hAnsi="Times New Roman" w:cs="Times New Roman"/>
-          <w:sz w:val="28"/>
-          <w:szCs w:val="28"/>
-        </w:rPr>
-        <w:t>em</w:t>
-      </w:r>
-      <w:proofErr w:type="spellEnd"/>
-      <w:r>
-        <w:rPr>
-          <w:rFonts w:ascii="Times New Roman" w:hAnsi="Times New Roman" w:cs="Times New Roman"/>
-          <w:sz w:val="28"/>
-          <w:szCs w:val="28"/>
-        </w:rPr>
-        <w:t xml:space="preserve">&gt;&lt;strong&gt;Hint:&lt;/strong&gt; Think about how each device deals with IP addresses, MAC addresses, and the types of networks they </w:t>
-      </w:r>
-      <w:proofErr w:type="gramStart"/>
-      <w:r>
-        <w:rPr>
-          <w:rFonts w:ascii="Times New Roman" w:hAnsi="Times New Roman" w:cs="Times New Roman"/>
-          <w:sz w:val="28"/>
-          <w:szCs w:val="28"/>
-        </w:rPr>
-        <w:t>connect.&lt;</w:t>
-      </w:r>
-      <w:proofErr w:type="gramEnd"/>
-      <w:r>
-        <w:rPr>
-          <w:rFonts w:ascii="Times New Roman" w:hAnsi="Times New Roman" w:cs="Times New Roman"/>
-          <w:sz w:val="28"/>
-          <w:szCs w:val="28"/>
-        </w:rPr>
-        <w:t>/</w:t>
-      </w:r>
-      <w:proofErr w:type="spellStart"/>
-      <w:r>
-        <w:rPr>
-          <w:rFonts w:ascii="Times New Roman" w:hAnsi="Times New Roman" w:cs="Times New Roman"/>
-          <w:sz w:val="28"/>
-          <w:szCs w:val="28"/>
-        </w:rPr>
-        <w:t>em</w:t>
-      </w:r>
-      <w:proofErr w:type="spellEnd"/>
-      <w:r>
-        <w:rPr>
-          <w:rFonts w:ascii="Times New Roman" w:hAnsi="Times New Roman" w:cs="Times New Roman"/>
-          <w:sz w:val="28"/>
-          <w:szCs w:val="28"/>
-        </w:rPr>
-        <w:t>&gt;</w:t>
+        <w:t>List 3 key differences between routers and switches in terms of their main functions and how they handle network traffic.&lt;br&gt;&lt;br&gt;&lt;em&gt;&lt;strong&gt;Hint:&lt;/strong&gt; Think about how each device deals with IP addresses, MAC addresses, and the types of networks they connect.&lt;/em&gt;</w:t>
       </w:r>
     </w:p>
     <w:p>
@@ -936,8 +752,43 @@
           <w:szCs w:val="28"/>
         </w:rPr>
         <w:br/>
-      </w:r>
-      <w:r>
+        <w:t>QUE-03</w:t>
+      </w:r>
+      <w:r>
+        <w:rPr>
+          <w:rFonts w:ascii="Times New Roman" w:hAnsi="Times New Roman" w:cs="Times New Roman"/>
+          <w:sz w:val="28"/>
+          <w:szCs w:val="28"/>
+        </w:rPr>
+        <w:t xml:space="preserve"> </w:t>
+      </w:r>
+      <w:r>
+        <w:rPr>
+          <w:rFonts w:ascii="Times New Roman" w:hAnsi="Times New Roman" w:cs="Times New Roman"/>
+          <w:sz w:val="28"/>
+          <w:szCs w:val="28"/>
+        </w:rPr>
+        <w:t>Take a real or virtual image of a router and a switch (from your home, lab, or Google Images), and identify the following on each: Power port, at least 2 Ethernet ports, and any LED indicators. Annotate the image or describe their position</w:t>
+      </w:r>
+      <w:r>
+        <w:rPr>
+          <w:rFonts w:ascii="Times New Roman" w:hAnsi="Times New Roman" w:cs="Times New Roman"/>
+          <w:sz w:val="28"/>
+          <w:szCs w:val="28"/>
+        </w:rPr>
+        <w:t xml:space="preserve"> </w:t>
+      </w:r>
+      <w:r>
+        <w:rPr>
+          <w:rFonts w:ascii="Times New Roman" w:hAnsi="Times New Roman" w:cs="Times New Roman"/>
+          <w:sz w:val="28"/>
+          <w:szCs w:val="28"/>
+        </w:rPr>
+        <w:t>and purpose.</w:t>
+      </w:r>
+    </w:p>
+    <w:p>
+      <w:pPr>
         <w:rPr>
           <w:rFonts w:ascii="Times New Roman" w:hAnsi="Times New Roman" w:cs="Times New Roman"/>
           <w:b/>
@@ -945,43 +796,8 @@
           <w:sz w:val="28"/>
           <w:szCs w:val="28"/>
         </w:rPr>
-        <w:t>QUE-03</w:t>
-      </w:r>
-      <w:r>
-        <w:rPr>
-          <w:rFonts w:ascii="Times New Roman" w:hAnsi="Times New Roman" w:cs="Times New Roman"/>
-          <w:sz w:val="28"/>
-          <w:szCs w:val="28"/>
-        </w:rPr>
-        <w:t xml:space="preserve"> </w:t>
-      </w:r>
-      <w:r>
-        <w:rPr>
-          <w:rFonts w:ascii="Times New Roman" w:hAnsi="Times New Roman" w:cs="Times New Roman"/>
-          <w:sz w:val="28"/>
-          <w:szCs w:val="28"/>
-        </w:rPr>
-        <w:t>Take a real or virtual image of a router and a switch (from your home, lab, or Google Images), and identify the following on each: Power port, at least 2 Ethernet ports, and any LED indicators. Annotate the image or describe their position</w:t>
-      </w:r>
-      <w:r>
-        <w:rPr>
-          <w:rFonts w:ascii="Times New Roman" w:hAnsi="Times New Roman" w:cs="Times New Roman"/>
-          <w:sz w:val="28"/>
-          <w:szCs w:val="28"/>
-        </w:rPr>
-        <w:t xml:space="preserve"> </w:t>
-      </w:r>
-      <w:r>
-        <w:rPr>
-          <w:rFonts w:ascii="Times New Roman" w:hAnsi="Times New Roman" w:cs="Times New Roman"/>
-          <w:sz w:val="28"/>
-          <w:szCs w:val="28"/>
-        </w:rPr>
-        <w:t>and purpose.</w:t>
-      </w:r>
-    </w:p>
-    <w:p>
-      <w:pPr>
+      </w:pPr>
+      <w:r>
         <w:rPr>
           <w:rFonts w:ascii="Times New Roman" w:hAnsi="Times New Roman" w:cs="Times New Roman"/>
           <w:b/>
@@ -989,8 +805,11 @@
           <w:sz w:val="28"/>
           <w:szCs w:val="28"/>
         </w:rPr>
-      </w:pPr>
-      <w:r>
+        <w:t>ANS</w:t>
+      </w:r>
+    </w:p>
+    <w:p>
+      <w:pPr>
         <w:rPr>
           <w:rFonts w:ascii="Times New Roman" w:hAnsi="Times New Roman" w:cs="Times New Roman"/>
           <w:b/>
@@ -998,11 +817,8 @@
           <w:sz w:val="28"/>
           <w:szCs w:val="28"/>
         </w:rPr>
-        <w:t>ANS</w:t>
-      </w:r>
-    </w:p>
-    <w:p>
-      <w:pPr>
+      </w:pPr>
+      <w:r>
         <w:rPr>
           <w:rFonts w:ascii="Times New Roman" w:hAnsi="Times New Roman" w:cs="Times New Roman"/>
           <w:b/>
@@ -1010,15 +826,6 @@
           <w:sz w:val="28"/>
           <w:szCs w:val="28"/>
         </w:rPr>
-      </w:pPr>
-      <w:r>
-        <w:rPr>
-          <w:rFonts w:ascii="Times New Roman" w:hAnsi="Times New Roman" w:cs="Times New Roman"/>
-          <w:b/>
-          <w:bCs/>
-          <w:sz w:val="28"/>
-          <w:szCs w:val="28"/>
-        </w:rPr>
         <w:t>1. Wi-Fi Router</w:t>
       </w:r>
     </w:p>
@@ -1033,6 +840,7 @@
       <w:r>
         <w:rPr>
           <w:rFonts w:ascii="Times New Roman" w:hAnsi="Times New Roman" w:cs="Times New Roman"/>
+          <w:noProof/>
           <w:sz w:val="28"/>
           <w:szCs w:val="28"/>
         </w:rPr>
@@ -1578,6 +1386,7 @@
       <w:r>
         <w:rPr>
           <w:rFonts w:ascii="Times New Roman" w:hAnsi="Times New Roman" w:cs="Times New Roman"/>
+          <w:noProof/>
           <w:sz w:val="28"/>
           <w:szCs w:val="28"/>
         </w:rPr>
@@ -3223,6 +3032,7 @@
   <w:style w:type="character" w:default="1" w:styleId="DefaultParagraphFont">
     <w:name w:val="Default Paragraph Font"/>
     <w:uiPriority w:val="1"/>
+    <w:semiHidden/>
     <w:unhideWhenUsed/>
   </w:style>
   <w:style w:type="table" w:default="1" w:styleId="TableNormal">

</xml_diff>